<commit_message>
Added Screenshots 7 through 9, updated the HTML to ajust website look and notade changes on Lab book
</commit_message>
<xml_diff>
--- a/Lab 2 Placeholder.docx
+++ b/Lab 2 Placeholder.docx
@@ -17,6 +17,9 @@
     </w:p>
     <w:p>
       <w:r>
+        <w:rPr>
+          <w:noProof/>
+        </w:rPr>
         <w:drawing>
           <wp:inline distT="0" distB="0" distL="0" distR="0" wp14:anchorId="2A7976D8" wp14:editId="4924FEA5">
             <wp:extent cx="5731510" cy="1821180"/>
@@ -69,6 +72,9 @@
     </w:p>
     <w:p>
       <w:r>
+        <w:rPr>
+          <w:noProof/>
+        </w:rPr>
         <w:drawing>
           <wp:inline distT="0" distB="0" distL="0" distR="0" wp14:anchorId="279F0B19" wp14:editId="3941ADD8">
             <wp:extent cx="5731510" cy="1594485"/>
@@ -116,13 +122,7 @@
       </w:r>
       <w:proofErr w:type="spellEnd"/>
       <w:r>
-        <w:t xml:space="preserve"> within the workspace folder of my user folder on the windows drive, file path ‘</w:t>
-      </w:r>
-      <w:r>
-        <w:t>C:\Users\961655\Workspace\ArchOSC Assignment</w:t>
-      </w:r>
-      <w:r>
-        <w:t xml:space="preserve">’. I Then created a folder within that assignment folder called ‘pictures’ that contains any relevant screenshots. </w:t>
+        <w:t xml:space="preserve"> within the workspace folder of my user folder on the windows drive, file path ‘C:\Users\961655\Workspace\ArchOSC Assignment’. I Then created a folder within that assignment folder called ‘pictures’ that contains any relevant screenshots. </w:t>
       </w:r>
     </w:p>
     <w:p>
@@ -132,6 +132,9 @@
     </w:p>
     <w:p>
       <w:r>
+        <w:rPr>
+          <w:noProof/>
+        </w:rPr>
         <w:drawing>
           <wp:inline distT="0" distB="0" distL="0" distR="0" wp14:anchorId="1E9A273A" wp14:editId="32EF0059">
             <wp:extent cx="5731510" cy="1533525"/>
@@ -212,6 +215,9 @@
     </w:p>
     <w:p>
       <w:r>
+        <w:rPr>
+          <w:noProof/>
+        </w:rPr>
         <w:lastRenderedPageBreak/>
         <w:drawing>
           <wp:inline distT="0" distB="0" distL="0" distR="0" wp14:anchorId="4515C61B" wp14:editId="77CFD52D">
@@ -279,6 +285,9 @@
     </w:p>
     <w:p>
       <w:r>
+        <w:rPr>
+          <w:noProof/>
+        </w:rPr>
         <w:drawing>
           <wp:inline distT="0" distB="0" distL="0" distR="0" wp14:anchorId="230F5272" wp14:editId="4D1937A3">
             <wp:extent cx="5731510" cy="1735455"/>
@@ -335,6 +344,9 @@
     </w:p>
     <w:p>
       <w:r>
+        <w:rPr>
+          <w:noProof/>
+        </w:rPr>
         <w:lastRenderedPageBreak/>
         <w:drawing>
           <wp:inline distT="0" distB="0" distL="0" distR="0" wp14:anchorId="050E2F3B" wp14:editId="68E8C33B">
@@ -403,6 +415,190 @@
       </w:r>
       <w:r>
         <w:t xml:space="preserve"> commit and push it will be added to the online repo.</w:t>
+      </w:r>
+    </w:p>
+    <w:p>
+      <w:r>
+        <w:t>Screenshot 7 GIT commit</w:t>
+      </w:r>
+    </w:p>
+    <w:p>
+      <w:r>
+        <w:drawing>
+          <wp:inline distT="0" distB="0" distL="0" distR="0" wp14:anchorId="6647D8CF" wp14:editId="7307E66F">
+            <wp:extent cx="5731510" cy="4084320"/>
+            <wp:effectExtent l="0" t="0" r="2540" b="0"/>
+            <wp:docPr id="1450743705" name="Picture 1"/>
+            <wp:cNvGraphicFramePr>
+              <a:graphicFrameLocks xmlns:a="http://schemas.openxmlformats.org/drawingml/2006/main" noChangeAspect="1"/>
+            </wp:cNvGraphicFramePr>
+            <a:graphic xmlns:a="http://schemas.openxmlformats.org/drawingml/2006/main">
+              <a:graphicData uri="http://schemas.openxmlformats.org/drawingml/2006/picture">
+                <pic:pic xmlns:pic="http://schemas.openxmlformats.org/drawingml/2006/picture">
+                  <pic:nvPicPr>
+                    <pic:cNvPr id="1450743705" name=""/>
+                    <pic:cNvPicPr/>
+                  </pic:nvPicPr>
+                  <pic:blipFill>
+                    <a:blip r:embed="rId10"/>
+                    <a:stretch>
+                      <a:fillRect/>
+                    </a:stretch>
+                  </pic:blipFill>
+                  <pic:spPr>
+                    <a:xfrm>
+                      <a:off x="0" y="0"/>
+                      <a:ext cx="5731510" cy="4084320"/>
+                    </a:xfrm>
+                    <a:prstGeom prst="rect">
+                      <a:avLst/>
+                    </a:prstGeom>
+                  </pic:spPr>
+                </pic:pic>
+              </a:graphicData>
+            </a:graphic>
+          </wp:inline>
+        </w:drawing>
+      </w:r>
+    </w:p>
+    <w:p>
+      <w:r>
+        <w:lastRenderedPageBreak/>
+        <w:t>Used CLI to stage the new files, ready to be saved to the online repo as soon as I push it. Additionally includes a full commit message to make clear what has been altered.</w:t>
+      </w:r>
+    </w:p>
+    <w:p>
+      <w:r>
+        <w:t>Screenshot 8 GIT Push</w:t>
+      </w:r>
+    </w:p>
+    <w:p>
+      <w:r>
+        <w:drawing>
+          <wp:inline distT="0" distB="0" distL="0" distR="0" wp14:anchorId="6097959C" wp14:editId="1CC2B667">
+            <wp:extent cx="5731510" cy="3613150"/>
+            <wp:effectExtent l="0" t="0" r="2540" b="6350"/>
+            <wp:docPr id="795206216" name="Picture 1"/>
+            <wp:cNvGraphicFramePr>
+              <a:graphicFrameLocks xmlns:a="http://schemas.openxmlformats.org/drawingml/2006/main" noChangeAspect="1"/>
+            </wp:cNvGraphicFramePr>
+            <a:graphic xmlns:a="http://schemas.openxmlformats.org/drawingml/2006/main">
+              <a:graphicData uri="http://schemas.openxmlformats.org/drawingml/2006/picture">
+                <pic:pic xmlns:pic="http://schemas.openxmlformats.org/drawingml/2006/picture">
+                  <pic:nvPicPr>
+                    <pic:cNvPr id="795206216" name=""/>
+                    <pic:cNvPicPr/>
+                  </pic:nvPicPr>
+                  <pic:blipFill>
+                    <a:blip r:embed="rId11"/>
+                    <a:stretch>
+                      <a:fillRect/>
+                    </a:stretch>
+                  </pic:blipFill>
+                  <pic:spPr>
+                    <a:xfrm>
+                      <a:off x="0" y="0"/>
+                      <a:ext cx="5731510" cy="3613150"/>
+                    </a:xfrm>
+                    <a:prstGeom prst="rect">
+                      <a:avLst/>
+                    </a:prstGeom>
+                  </pic:spPr>
+                </pic:pic>
+              </a:graphicData>
+            </a:graphic>
+          </wp:inline>
+        </w:drawing>
+      </w:r>
+    </w:p>
+    <w:p>
+      <w:r>
+        <w:t>Pushed the files to the online repo, saving them on git hub online as opposed to just locally.</w:t>
+      </w:r>
+    </w:p>
+    <w:p>
+      <w:r>
+        <w:t>Screenshot 9 Changes to Website</w:t>
+      </w:r>
+    </w:p>
+    <w:p>
+      <w:r>
+        <w:rPr>
+          <w:b/>
+          <w:bCs/>
+        </w:rPr>
+        <w:drawing>
+          <wp:inline distT="0" distB="0" distL="0" distR="0" wp14:anchorId="2A00808B" wp14:editId="6784DC53">
+            <wp:extent cx="5731510" cy="2894965"/>
+            <wp:effectExtent l="0" t="0" r="2540" b="635"/>
+            <wp:docPr id="283483200" name="Picture 1"/>
+            <wp:cNvGraphicFramePr>
+              <a:graphicFrameLocks xmlns:a="http://schemas.openxmlformats.org/drawingml/2006/main" noChangeAspect="1"/>
+            </wp:cNvGraphicFramePr>
+            <a:graphic xmlns:a="http://schemas.openxmlformats.org/drawingml/2006/main">
+              <a:graphicData uri="http://schemas.openxmlformats.org/drawingml/2006/picture">
+                <pic:pic xmlns:pic="http://schemas.openxmlformats.org/drawingml/2006/picture">
+                  <pic:nvPicPr>
+                    <pic:cNvPr id="283483200" name=""/>
+                    <pic:cNvPicPr/>
+                  </pic:nvPicPr>
+                  <pic:blipFill>
+                    <a:blip r:embed="rId12"/>
+                    <a:stretch>
+                      <a:fillRect/>
+                    </a:stretch>
+                  </pic:blipFill>
+                  <pic:spPr>
+                    <a:xfrm>
+                      <a:off x="0" y="0"/>
+                      <a:ext cx="5731510" cy="2894965"/>
+                    </a:xfrm>
+                    <a:prstGeom prst="rect">
+                      <a:avLst/>
+                    </a:prstGeom>
+                  </pic:spPr>
+                </pic:pic>
+              </a:graphicData>
+            </a:graphic>
+          </wp:inline>
+        </w:drawing>
+      </w:r>
+    </w:p>
+    <w:p>
+      <w:r>
+        <w:lastRenderedPageBreak/>
+        <w:t>By adjusting the hex code set for the background I was able to shift the colour to my personal favourite forest green (#</w:t>
+      </w:r>
+      <w:r>
+        <w:rPr>
+          <w:b/>
+          <w:bCs/>
+        </w:rPr>
+        <w:t>228B22</w:t>
+      </w:r>
+      <w:r>
+        <w:t xml:space="preserve">), added my name in place of the ‘insert name here’ and added </w:t>
+      </w:r>
+      <w:r>
+        <w:t>a</w:t>
+      </w:r>
+      <w:r>
+        <w:t xml:space="preserve"> </w:t>
+      </w:r>
+      <w:r>
+        <w:t>(</w:t>
+      </w:r>
+      <w:r>
+        <w:t>work in progress</w:t>
+      </w:r>
+      <w:r>
+        <w:t>)</w:t>
+      </w:r>
+      <w:r>
+        <w:t xml:space="preserve"> nav bar to be used to navigate pages later on.</w:t>
+      </w:r>
+      <w:r>
+        <w:t xml:space="preserve"> Three separate changes to the website through editing the HTML file.</w:t>
       </w:r>
     </w:p>
     <w:sectPr>

</xml_diff>

<commit_message>
Updated Lab includes screenshot 10 and 11
</commit_message>
<xml_diff>
--- a/Lab 2 Placeholder.docx
+++ b/Lab 2 Placeholder.docx
@@ -4,15 +4,7 @@
   <w:body>
     <w:p>
       <w:r>
-        <w:t xml:space="preserve">Screenshot 1 – </w:t>
-      </w:r>
-      <w:proofErr w:type="spellStart"/>
-      <w:r>
-        <w:t>ArchOSC</w:t>
-      </w:r>
-      <w:proofErr w:type="spellEnd"/>
-      <w:r>
-        <w:t xml:space="preserve"> folder external</w:t>
+        <w:t>Screenshot 1 – ArchOSC folder external</w:t>
       </w:r>
     </w:p>
     <w:p>
@@ -59,15 +51,7 @@
     </w:p>
     <w:p>
       <w:r>
-        <w:t xml:space="preserve">Screenshot 2 – </w:t>
-      </w:r>
-      <w:proofErr w:type="spellStart"/>
-      <w:r>
-        <w:t>ArchOSC</w:t>
-      </w:r>
-      <w:proofErr w:type="spellEnd"/>
-      <w:r>
-        <w:t xml:space="preserve"> folder internal</w:t>
+        <w:t>Screenshot 2 – ArchOSC folder internal</w:t>
       </w:r>
     </w:p>
     <w:p>
@@ -114,15 +98,7 @@
     </w:p>
     <w:p>
       <w:r>
-        <w:t xml:space="preserve">Created an assignment folder for saving details and progress related to my </w:t>
-      </w:r>
-      <w:proofErr w:type="spellStart"/>
-      <w:r>
-        <w:t>ArchOSC</w:t>
-      </w:r>
-      <w:proofErr w:type="spellEnd"/>
-      <w:r>
-        <w:t xml:space="preserve"> within the workspace folder of my user folder on the windows drive, file path ‘C:\Users\961655\Workspace\ArchOSC Assignment’. I Then created a folder within that assignment folder called ‘pictures’ that contains any relevant screenshots. </w:t>
+        <w:t xml:space="preserve">Created an assignment folder for saving details and progress related to my ArchOSC within the workspace folder of my user folder on the windows drive, file path ‘C:\Users\961655\Workspace\ArchOSC Assignment’. I Then created a folder within that assignment folder called ‘pictures’ that contains any relevant screenshots. </w:t>
       </w:r>
     </w:p>
     <w:p>
@@ -258,15 +234,7 @@
     </w:p>
     <w:p>
       <w:r>
-        <w:t xml:space="preserve">Created an online GIT repo to save assignment files too and use source control, </w:t>
-      </w:r>
-      <w:proofErr w:type="gramStart"/>
-      <w:r>
-        <w:t>Named</w:t>
-      </w:r>
-      <w:proofErr w:type="gramEnd"/>
-      <w:r>
-        <w:t xml:space="preserve"> as shown above, set to private, with a read me file and</w:t>
+        <w:t>Created an online GIT repo to save assignment files too and use source control, Named as shown above, set to private, with a read me file and</w:t>
       </w:r>
       <w:r>
         <w:t xml:space="preserve"> git ignore</w:t>
@@ -424,6 +392,9 @@
     </w:p>
     <w:p>
       <w:r>
+        <w:rPr>
+          <w:noProof/>
+        </w:rPr>
         <w:drawing>
           <wp:inline distT="0" distB="0" distL="0" distR="0" wp14:anchorId="6647D8CF" wp14:editId="7307E66F">
             <wp:extent cx="5731510" cy="4084320"/>
@@ -474,6 +445,9 @@
     </w:p>
     <w:p>
       <w:r>
+        <w:rPr>
+          <w:noProof/>
+        </w:rPr>
         <w:drawing>
           <wp:inline distT="0" distB="0" distL="0" distR="0" wp14:anchorId="6097959C" wp14:editId="1CC2B667">
             <wp:extent cx="5731510" cy="3613150"/>
@@ -526,6 +500,7 @@
         <w:rPr>
           <w:b/>
           <w:bCs/>
+          <w:noProof/>
         </w:rPr>
         <w:drawing>
           <wp:inline distT="0" distB="0" distL="0" distR="0" wp14:anchorId="2A00808B" wp14:editId="6784DC53">
@@ -599,6 +574,107 @@
       </w:r>
       <w:r>
         <w:t xml:space="preserve"> Three separate changes to the website through editing the HTML file.</w:t>
+      </w:r>
+    </w:p>
+    <w:p>
+      <w:r>
+        <w:t>Screenshot 10 Pushed updated HTML &amp; 11 Pushed Pictures 1-9</w:t>
+      </w:r>
+    </w:p>
+    <w:p>
+      <w:r>
+        <w:drawing>
+          <wp:inline distT="0" distB="0" distL="0" distR="0" wp14:anchorId="1AB4E1C2" wp14:editId="2BF5EEBD">
+            <wp:extent cx="5731510" cy="3669665"/>
+            <wp:effectExtent l="0" t="0" r="2540" b="6985"/>
+            <wp:docPr id="832446836" name="Picture 1"/>
+            <wp:cNvGraphicFramePr>
+              <a:graphicFrameLocks xmlns:a="http://schemas.openxmlformats.org/drawingml/2006/main" noChangeAspect="1"/>
+            </wp:cNvGraphicFramePr>
+            <a:graphic xmlns:a="http://schemas.openxmlformats.org/drawingml/2006/main">
+              <a:graphicData uri="http://schemas.openxmlformats.org/drawingml/2006/picture">
+                <pic:pic xmlns:pic="http://schemas.openxmlformats.org/drawingml/2006/picture">
+                  <pic:nvPicPr>
+                    <pic:cNvPr id="832446836" name=""/>
+                    <pic:cNvPicPr/>
+                  </pic:nvPicPr>
+                  <pic:blipFill>
+                    <a:blip r:embed="rId13"/>
+                    <a:stretch>
+                      <a:fillRect/>
+                    </a:stretch>
+                  </pic:blipFill>
+                  <pic:spPr>
+                    <a:xfrm>
+                      <a:off x="0" y="0"/>
+                      <a:ext cx="5731510" cy="3669665"/>
+                    </a:xfrm>
+                    <a:prstGeom prst="rect">
+                      <a:avLst/>
+                    </a:prstGeom>
+                  </pic:spPr>
+                </pic:pic>
+              </a:graphicData>
+            </a:graphic>
+          </wp:inline>
+        </w:drawing>
+      </w:r>
+    </w:p>
+    <w:p>
+      <w:r>
+        <w:drawing>
+          <wp:inline distT="0" distB="0" distL="0" distR="0" wp14:anchorId="7E3F48A1" wp14:editId="62012D8D">
+            <wp:extent cx="5731510" cy="2249170"/>
+            <wp:effectExtent l="0" t="0" r="2540" b="0"/>
+            <wp:docPr id="1465907340" name="Picture 2"/>
+            <wp:cNvGraphicFramePr>
+              <a:graphicFrameLocks xmlns:a="http://schemas.openxmlformats.org/drawingml/2006/main" noChangeAspect="1"/>
+            </wp:cNvGraphicFramePr>
+            <a:graphic xmlns:a="http://schemas.openxmlformats.org/drawingml/2006/main">
+              <a:graphicData uri="http://schemas.openxmlformats.org/drawingml/2006/picture">
+                <pic:pic xmlns:pic="http://schemas.openxmlformats.org/drawingml/2006/picture">
+                  <pic:nvPicPr>
+                    <pic:cNvPr id="0" name="Picture 6"/>
+                    <pic:cNvPicPr>
+                      <a:picLocks noChangeAspect="1" noChangeArrowheads="1"/>
+                    </pic:cNvPicPr>
+                  </pic:nvPicPr>
+                  <pic:blipFill>
+                    <a:blip r:embed="rId14" cstate="print">
+                      <a:extLst>
+                        <a:ext uri="{28A0092B-C50C-407E-A947-70E740481C1C}">
+                          <a14:useLocalDpi xmlns:a14="http://schemas.microsoft.com/office/drawing/2010/main" val="0"/>
+                        </a:ext>
+                      </a:extLst>
+                    </a:blip>
+                    <a:srcRect/>
+                    <a:stretch>
+                      <a:fillRect/>
+                    </a:stretch>
+                  </pic:blipFill>
+                  <pic:spPr bwMode="auto">
+                    <a:xfrm>
+                      <a:off x="0" y="0"/>
+                      <a:ext cx="5731510" cy="2249170"/>
+                    </a:xfrm>
+                    <a:prstGeom prst="rect">
+                      <a:avLst/>
+                    </a:prstGeom>
+                    <a:noFill/>
+                    <a:ln>
+                      <a:noFill/>
+                    </a:ln>
+                  </pic:spPr>
+                </pic:pic>
+              </a:graphicData>
+            </a:graphic>
+          </wp:inline>
+        </w:drawing>
+      </w:r>
+    </w:p>
+    <w:p>
+      <w:r>
+        <w:t>Pushed the updated HTML file with my edits and the new photos used I this lab bok to the online repo.</w:t>
       </w:r>
     </w:p>
     <w:sectPr>

</xml_diff>

<commit_message>
Transfered documentation from word doc to html + added iScreenshot 12
</commit_message>
<xml_diff>
--- a/Lab 2 Placeholder.docx
+++ b/Lab 2 Placeholder.docx
@@ -4,7 +4,32 @@
   <w:body>
     <w:p>
       <w:r>
-        <w:t>Screenshot 1 – ArchOSC folder external</w:t>
+        <w:t xml:space="preserve">Screenshot 1 </w:t>
+      </w:r>
+      <w:proofErr w:type="spellStart"/>
+      <w:r>
+        <w:t>ArchOSC</w:t>
+      </w:r>
+      <w:proofErr w:type="spellEnd"/>
+      <w:r>
+        <w:t xml:space="preserve"> folder external</w:t>
+      </w:r>
+      <w:r>
+        <w:t xml:space="preserve"> &amp;</w:t>
+      </w:r>
+      <w:r>
+        <w:t xml:space="preserve"> </w:t>
+      </w:r>
+      <w:r>
+        <w:t xml:space="preserve">2 </w:t>
+      </w:r>
+      <w:proofErr w:type="spellStart"/>
+      <w:r>
+        <w:t>ArchOSC</w:t>
+      </w:r>
+      <w:proofErr w:type="spellEnd"/>
+      <w:r>
+        <w:t xml:space="preserve"> folder internal</w:t>
       </w:r>
     </w:p>
     <w:p>
@@ -51,11 +76,6 @@
     </w:p>
     <w:p>
       <w:r>
-        <w:t>Screenshot 2 – ArchOSC folder internal</w:t>
-      </w:r>
-    </w:p>
-    <w:p>
-      <w:r>
         <w:rPr>
           <w:noProof/>
         </w:rPr>
@@ -98,7 +118,23 @@
     </w:p>
     <w:p>
       <w:r>
-        <w:t xml:space="preserve">Created an assignment folder for saving details and progress related to my ArchOSC within the workspace folder of my user folder on the windows drive, file path ‘C:\Users\961655\Workspace\ArchOSC Assignment’. I Then created a folder within that assignment folder called ‘pictures’ that contains any relevant screenshots. </w:t>
+        <w:t xml:space="preserve">Created an assignment folder for saving details and progress related to my </w:t>
+      </w:r>
+      <w:proofErr w:type="spellStart"/>
+      <w:r>
+        <w:t>ArchOSC</w:t>
+      </w:r>
+      <w:proofErr w:type="spellEnd"/>
+      <w:r>
+        <w:t xml:space="preserve"> within the workspace folder of my user folder on the windows drive, file path ‘C:\Users\961655\Workspace\</w:t>
+      </w:r>
+      <w:proofErr w:type="spellStart"/>
+      <w:r>
+        <w:t>ArchOSC</w:t>
+      </w:r>
+      <w:proofErr w:type="spellEnd"/>
+      <w:r>
+        <w:t xml:space="preserve"> Assignment’. I Then created a folder within that assignment folder called ‘pictures’ that contains any relevant screenshots. </w:t>
       </w:r>
     </w:p>
     <w:p>
@@ -234,7 +270,15 @@
     </w:p>
     <w:p>
       <w:r>
-        <w:t>Created an online GIT repo to save assignment files too and use source control, Named as shown above, set to private, with a read me file and</w:t>
+        <w:t xml:space="preserve">Created an online GIT repo to save assignment files too and use source control, </w:t>
+      </w:r>
+      <w:proofErr w:type="gramStart"/>
+      <w:r>
+        <w:t>Named</w:t>
+      </w:r>
+      <w:proofErr w:type="gramEnd"/>
+      <w:r>
+        <w:t xml:space="preserve"> as shown above, set to private, with a read me file and</w:t>
       </w:r>
       <w:r>
         <w:t xml:space="preserve"> git ignore</w:t>
@@ -542,7 +586,15 @@
     <w:p>
       <w:r>
         <w:lastRenderedPageBreak/>
-        <w:t>By adjusting the hex code set for the background I was able to shift the colour to my personal favourite forest green (#</w:t>
+        <w:t xml:space="preserve">By adjusting the hex code set for the </w:t>
+      </w:r>
+      <w:proofErr w:type="gramStart"/>
+      <w:r>
+        <w:t>background</w:t>
+      </w:r>
+      <w:proofErr w:type="gramEnd"/>
+      <w:r>
+        <w:t xml:space="preserve"> I was able to shift the colour to my personal favourite forest green (#</w:t>
       </w:r>
       <w:r>
         <w:rPr>
@@ -570,7 +622,15 @@
         <w:t>)</w:t>
       </w:r>
       <w:r>
-        <w:t xml:space="preserve"> nav bar to be used to navigate pages later on.</w:t>
+        <w:t xml:space="preserve"> nav bar to be used to navigate pages </w:t>
+      </w:r>
+      <w:proofErr w:type="gramStart"/>
+      <w:r>
+        <w:t>later on</w:t>
+      </w:r>
+      <w:proofErr w:type="gramEnd"/>
+      <w:r>
+        <w:t>.</w:t>
       </w:r>
       <w:r>
         <w:t xml:space="preserve"> Three separate changes to the website through editing the HTML file.</w:t>
@@ -583,6 +643,9 @@
     </w:p>
     <w:p>
       <w:r>
+        <w:rPr>
+          <w:noProof/>
+        </w:rPr>
         <w:drawing>
           <wp:inline distT="0" distB="0" distL="0" distR="0" wp14:anchorId="1AB4E1C2" wp14:editId="2BF5EEBD">
             <wp:extent cx="5731510" cy="3669665"/>
@@ -622,8 +685,11 @@
     </w:p>
     <w:p>
       <w:r>
+        <w:rPr>
+          <w:noProof/>
+        </w:rPr>
         <w:drawing>
-          <wp:inline distT="0" distB="0" distL="0" distR="0" wp14:anchorId="7E3F48A1" wp14:editId="62012D8D">
+          <wp:inline distT="0" distB="0" distL="0" distR="0" wp14:anchorId="7E3F48A1" wp14:editId="58775CB5">
             <wp:extent cx="5731510" cy="2249170"/>
             <wp:effectExtent l="0" t="0" r="2540" b="0"/>
             <wp:docPr id="1465907340" name="Picture 2"/>
@@ -675,6 +741,81 @@
     <w:p>
       <w:r>
         <w:t>Pushed the updated HTML file with my edits and the new photos used I this lab bok to the online repo.</w:t>
+      </w:r>
+    </w:p>
+    <w:p>
+      <w:r>
+        <w:t xml:space="preserve">Screenshot 12 Deployed through </w:t>
+      </w:r>
+      <w:proofErr w:type="spellStart"/>
+      <w:r>
+        <w:t>GITHub</w:t>
+      </w:r>
+      <w:proofErr w:type="spellEnd"/>
+      <w:r>
+        <w:t xml:space="preserve"> pages</w:t>
+      </w:r>
+    </w:p>
+    <w:p/>
+    <w:p>
+      <w:r>
+        <w:lastRenderedPageBreak/>
+        <w:drawing>
+          <wp:inline distT="0" distB="0" distL="0" distR="0" wp14:anchorId="4BD27E1C" wp14:editId="48EA2CE5">
+            <wp:extent cx="5731510" cy="1715770"/>
+            <wp:effectExtent l="0" t="0" r="2540" b="0"/>
+            <wp:docPr id="327441144" name="Picture 1"/>
+            <wp:cNvGraphicFramePr>
+              <a:graphicFrameLocks xmlns:a="http://schemas.openxmlformats.org/drawingml/2006/main" noChangeAspect="1"/>
+            </wp:cNvGraphicFramePr>
+            <a:graphic xmlns:a="http://schemas.openxmlformats.org/drawingml/2006/main">
+              <a:graphicData uri="http://schemas.openxmlformats.org/drawingml/2006/picture">
+                <pic:pic xmlns:pic="http://schemas.openxmlformats.org/drawingml/2006/picture">
+                  <pic:nvPicPr>
+                    <pic:cNvPr id="327441144" name=""/>
+                    <pic:cNvPicPr/>
+                  </pic:nvPicPr>
+                  <pic:blipFill>
+                    <a:blip r:embed="rId15"/>
+                    <a:stretch>
+                      <a:fillRect/>
+                    </a:stretch>
+                  </pic:blipFill>
+                  <pic:spPr>
+                    <a:xfrm>
+                      <a:off x="0" y="0"/>
+                      <a:ext cx="5731510" cy="1715770"/>
+                    </a:xfrm>
+                    <a:prstGeom prst="rect">
+                      <a:avLst/>
+                    </a:prstGeom>
+                  </pic:spPr>
+                </pic:pic>
+              </a:graphicData>
+            </a:graphic>
+          </wp:inline>
+        </w:drawing>
+      </w:r>
+    </w:p>
+    <w:p>
+      <w:r>
+        <w:t>I deployed the branch through GitHub pages, allowing the html file to be set up as a stable website, to do this I had to change my repo to public, dure to not owning a git enterprise or similar licence.</w:t>
+      </w:r>
+    </w:p>
+    <w:p>
+      <w:r>
+        <w:t>Reflection</w:t>
+      </w:r>
+    </w:p>
+    <w:p>
+      <w:r>
+        <w:t>Through, today I have become far more comfortable about using CLI to interact with git hub and how the materials for this assignment are to be saved.</w:t>
+      </w:r>
+      <w:r>
+        <w:t xml:space="preserve"> </w:t>
+      </w:r>
+      <w:r>
+        <w:t>Though I will need to look more into how to make use of HTML fully.</w:t>
       </w:r>
     </w:p>
     <w:sectPr>
@@ -1290,6 +1431,7 @@
   <w:style w:type="character" w:default="1" w:styleId="DefaultParagraphFont">
     <w:name w:val="Default Paragraph Font"/>
     <w:uiPriority w:val="1"/>
+    <w:semiHidden/>
     <w:unhideWhenUsed/>
   </w:style>
   <w:style w:type="table" w:default="1" w:styleId="TableNormal">

</xml_diff>